<commit_message>
Fixes in collection with lithuanians
</commit_message>
<xml_diff>
--- a/nationalities/litovtsy/litovtsy.docx
+++ b/nationalities/litovtsy/litovtsy.docx
@@ -366,7 +366,16 @@
                       <w:szCs w:val="28"/>
                       <w:lang w:val="en-US"/>
                     </w:rPr>
-                    <w:t>90</w:t>
+                    <w:t>9</w:t>
+                  </w:r>
+                  <w:r>
+                    <w:rPr>
+                      <w:rFonts w:ascii="Arial Black" w:hAnsi="Arial Black"/>
+                      <w:sz w:val="28"/>
+                      <w:szCs w:val="28"/>
+                      <w:lang w:val="en-US"/>
+                    </w:rPr>
+                    <w:t>7</w:t>
                   </w:r>
                 </w:p>
               </w:tc>
@@ -1766,58 +1775,41 @@
         </w:rPr>
         <w:t xml:space="preserve">Данный документ распространяется под лицензией </w:t>
       </w:r>
-      <w:r>
-        <w:fldChar w:fldCharType="begin"/>
-      </w:r>
-      <w:r>
-        <w:instrText xml:space="preserve"> HYPER</w:instrText>
-      </w:r>
-      <w:r>
-        <w:instrText xml:space="preserve">LINK "https://creativecommons.org/publicdomain/zero/1.0/" </w:instrText>
-      </w:r>
-      <w:r>
-        <w:fldChar w:fldCharType="separate"/>
-      </w:r>
-      <w:r>
-        <w:rPr>
-          <w:rStyle w:val="Hyperlink"/>
-          <w:lang w:val="en-US"/>
-        </w:rPr>
-        <w:t>CC</w:t>
-      </w:r>
-      <w:r>
-        <w:rPr>
-          <w:rStyle w:val="Hyperlink"/>
-        </w:rPr>
-        <w:t xml:space="preserve">0 </w:t>
-      </w:r>
-      <w:r>
-        <w:rPr>
-          <w:rStyle w:val="Hyperlink"/>
-          <w:lang w:val="en-US"/>
-        </w:rPr>
-        <w:t>Public</w:t>
-      </w:r>
-      <w:r>
-        <w:rPr>
-          <w:rStyle w:val="Hyperlink"/>
-        </w:rPr>
-        <w:t xml:space="preserve"> </w:t>
-      </w:r>
-      <w:r>
-        <w:rPr>
-          <w:rStyle w:val="Hyperlink"/>
-          <w:lang w:val="en-US"/>
-        </w:rPr>
-        <w:t>License</w:t>
-      </w:r>
-      <w:r>
-        <w:rPr>
-          <w:rStyle w:val="Hyperlink"/>
-          <w:lang w:val="en-US"/>
-        </w:rPr>
-        <w:fldChar w:fldCharType="end"/>
-      </w:r>
+      <w:hyperlink r:id="rId9" w:history="1">
+        <w:r>
+          <w:rPr>
+            <w:rStyle w:val="Hyperlink"/>
+            <w:lang w:val="en-US"/>
+          </w:rPr>
+          <w:t>CC</w:t>
+        </w:r>
+        <w:r>
+          <w:rPr>
+            <w:rStyle w:val="Hyperlink"/>
+          </w:rPr>
+          <w:t xml:space="preserve">0 </w:t>
+        </w:r>
+        <w:r>
+          <w:rPr>
+            <w:rStyle w:val="Hyperlink"/>
+            <w:lang w:val="en-US"/>
+          </w:rPr>
+          <w:t>Public</w:t>
+        </w:r>
+        <w:r>
+          <w:rPr>
+            <w:rStyle w:val="Hyperlink"/>
+          </w:rPr>
+          <w:t xml:space="preserve"> </w:t>
+        </w:r>
+        <w:r>
+          <w:rPr>
+            <w:rStyle w:val="Hyperlink"/>
+            <w:lang w:val="en-US"/>
+          </w:rPr>
+          <w:t>License</w:t>
+        </w:r>
+      </w:hyperlink>
     </w:p>
     <w:p>
       <w:pPr>
@@ -2021,7 +2013,7 @@
                           </pic:cNvPicPr>
                         </pic:nvPicPr>
                         <pic:blipFill>
-                          <a:blip r:embed="rId9" cstate="print">
+                          <a:blip r:embed="rId10" cstate="print">
                             <a:extLst>
                               <a:ext uri="{28A0092B-C50C-407E-A947-70E740481C1C}">
                                 <a14:useLocalDpi xmlns:a14="http://schemas.microsoft.com/office/drawing/2010/main" val="0"/>
@@ -2798,7 +2790,7 @@
                     </pic:cNvPicPr>
                   </pic:nvPicPr>
                   <pic:blipFill>
-                    <a:blip r:embed="rId10" cstate="print">
+                    <a:blip r:embed="rId11" cstate="print">
                       <a:extLst>
                         <a:ext uri="{28A0092B-C50C-407E-A947-70E740481C1C}">
                           <a14:useLocalDpi xmlns:a14="http://schemas.microsoft.com/office/drawing/2010/main" val="0"/>
@@ -2876,7 +2868,7 @@
       </w:r>
     </w:p>
     <w:p>
-      <w:hyperlink r:id="rId11" w:history="1">
+      <w:hyperlink r:id="rId12" w:history="1">
         <w:r>
           <w:rPr>
             <w:rStyle w:val="Hyperlink"/>
@@ -2891,7 +2883,7 @@
       </w:r>
     </w:p>
     <w:p>
-      <w:hyperlink r:id="rId12" w:history="1">
+      <w:hyperlink r:id="rId13" w:history="1">
         <w:r>
           <w:rPr>
             <w:rStyle w:val="Hyperlink"/>
@@ -2906,7 +2898,7 @@
       </w:r>
     </w:p>
     <w:p>
-      <w:hyperlink r:id="rId13" w:history="1">
+      <w:hyperlink r:id="rId14" w:history="1">
         <w:r>
           <w:rPr>
             <w:rStyle w:val="Hyperlink"/>
@@ -2921,7 +2913,7 @@
       </w:r>
     </w:p>
     <w:p>
-      <w:hyperlink r:id="rId14" w:history="1">
+      <w:hyperlink r:id="rId15" w:history="1">
         <w:r>
           <w:rPr>
             <w:rStyle w:val="Hyperlink"/>
@@ -2953,7 +2945,7 @@
           <w:lang w:val="ru-RU"/>
         </w:rPr>
       </w:pPr>
-      <w:hyperlink r:id="rId15" w:history="1">
+      <w:hyperlink r:id="rId16" w:history="1">
         <w:r>
           <w:rPr>
             <w:rStyle w:val="Hyperlink"/>
@@ -2969,7 +2961,7 @@
           <w:lang w:val="ru-RU"/>
         </w:rPr>
       </w:pPr>
-      <w:hyperlink r:id="rId16" w:history="1">
+      <w:hyperlink r:id="rId17" w:history="1">
         <w:r>
           <w:rPr>
             <w:rStyle w:val="Hyperlink"/>
@@ -2985,7 +2977,7 @@
           <w:lang w:val="ru-RU"/>
         </w:rPr>
       </w:pPr>
-      <w:hyperlink r:id="rId17" w:history="1">
+      <w:hyperlink r:id="rId18" w:history="1">
         <w:r>
           <w:rPr>
             <w:rStyle w:val="Hyperlink"/>
@@ -3001,7 +2993,7 @@
           <w:lang w:val="ru-RU"/>
         </w:rPr>
       </w:pPr>
-      <w:hyperlink r:id="rId18" w:history="1">
+      <w:hyperlink r:id="rId19" w:history="1">
         <w:r>
           <w:rPr>
             <w:rStyle w:val="Hyperlink"/>
@@ -3017,7 +3009,7 @@
           <w:lang w:val="ru-RU"/>
         </w:rPr>
       </w:pPr>
-      <w:hyperlink r:id="rId19" w:history="1">
+      <w:hyperlink r:id="rId20" w:history="1">
         <w:r>
           <w:rPr>
             <w:rStyle w:val="Hyperlink"/>
@@ -3033,7 +3025,7 @@
           <w:lang w:val="ru-RU"/>
         </w:rPr>
       </w:pPr>
-      <w:hyperlink r:id="rId20" w:history="1">
+      <w:hyperlink r:id="rId21" w:history="1">
         <w:r>
           <w:rPr>
             <w:rStyle w:val="Hyperlink"/>
@@ -3108,7 +3100,7 @@
                 <w:lang w:val="ru-RU"/>
               </w:rPr>
             </w:pPr>
-            <w:hyperlink r:id="rId21" w:history="1">
+            <w:hyperlink r:id="rId22" w:history="1">
               <w:r>
                 <w:rPr>
                   <w:rStyle w:val="Hyperlink"/>
@@ -3137,7 +3129,6 @@
                 </w:rPr>
                 <w:t>.</w:t>
               </w:r>
-              <w:proofErr w:type="spellStart"/>
               <w:r>
                 <w:rPr>
                   <w:rStyle w:val="Hyperlink"/>
@@ -3145,7 +3136,6 @@
                 </w:rPr>
                 <w:t>facebook</w:t>
               </w:r>
-              <w:proofErr w:type="spellEnd"/>
               <w:r>
                 <w:rPr>
                   <w:rStyle w:val="Hyperlink"/>
@@ -3167,7 +3157,6 @@
                 </w:rPr>
                 <w:t>/</w:t>
               </w:r>
-              <w:proofErr w:type="spellStart"/>
               <w:r>
                 <w:rPr>
                   <w:rStyle w:val="Hyperlink"/>
@@ -3175,7 +3164,6 @@
                 </w:rPr>
                 <w:t>irakli</w:t>
               </w:r>
-              <w:proofErr w:type="spellEnd"/>
               <w:r>
                 <w:rPr>
                   <w:rStyle w:val="Hyperlink"/>
@@ -3183,7 +3171,6 @@
                 </w:rPr>
                 <w:t>.</w:t>
               </w:r>
-              <w:proofErr w:type="spellStart"/>
               <w:r>
                 <w:rPr>
                   <w:rStyle w:val="Hyperlink"/>
@@ -3191,7 +3178,6 @@
                 </w:rPr>
                 <w:t>komaxidze</w:t>
               </w:r>
-              <w:proofErr w:type="spellEnd"/>
               <w:r>
                 <w:rPr>
                   <w:rStyle w:val="Hyperlink"/>
@@ -3213,7 +3199,6 @@
                 </w:rPr>
                 <w:t>/</w:t>
               </w:r>
-              <w:proofErr w:type="spellStart"/>
               <w:r>
                 <w:rPr>
                   <w:rStyle w:val="Hyperlink"/>
@@ -3221,7 +3206,6 @@
                 </w:rPr>
                 <w:t>pfbid</w:t>
               </w:r>
-              <w:proofErr w:type="spellEnd"/>
               <w:r>
                 <w:rPr>
                   <w:rStyle w:val="Hyperlink"/>
@@ -3229,7 +3213,6 @@
                 </w:rPr>
                 <w:t>02</w:t>
               </w:r>
-              <w:proofErr w:type="spellStart"/>
               <w:r>
                 <w:rPr>
                   <w:rStyle w:val="Hyperlink"/>
@@ -3237,7 +3220,6 @@
                 </w:rPr>
                 <w:t>rEu</w:t>
               </w:r>
-              <w:proofErr w:type="spellEnd"/>
               <w:r>
                 <w:rPr>
                   <w:rStyle w:val="Hyperlink"/>
@@ -3273,7 +3255,6 @@
                 </w:rPr>
                 <w:t>4</w:t>
               </w:r>
-              <w:proofErr w:type="spellStart"/>
               <w:r>
                 <w:rPr>
                   <w:rStyle w:val="Hyperlink"/>
@@ -3281,7 +3262,6 @@
                 </w:rPr>
                 <w:t>kGJNjPQ</w:t>
               </w:r>
-              <w:proofErr w:type="spellEnd"/>
               <w:r>
                 <w:rPr>
                   <w:rStyle w:val="Hyperlink"/>
@@ -3289,7 +3269,6 @@
                 </w:rPr>
                 <w:t>1</w:t>
               </w:r>
-              <w:proofErr w:type="spellStart"/>
               <w:r>
                 <w:rPr>
                   <w:rStyle w:val="Hyperlink"/>
@@ -3297,7 +3276,6 @@
                 </w:rPr>
                 <w:t>GDXGrZb</w:t>
               </w:r>
-              <w:proofErr w:type="spellEnd"/>
               <w:r>
                 <w:rPr>
                   <w:rStyle w:val="Hyperlink"/>
@@ -3305,7 +3283,6 @@
                 </w:rPr>
                 <w:t>9</w:t>
               </w:r>
-              <w:proofErr w:type="spellStart"/>
               <w:r>
                 <w:rPr>
                   <w:rStyle w:val="Hyperlink"/>
@@ -3313,7 +3290,6 @@
                 </w:rPr>
                 <w:t>VvzLkyhtJ</w:t>
               </w:r>
-              <w:proofErr w:type="spellEnd"/>
               <w:r>
                 <w:rPr>
                   <w:rStyle w:val="Hyperlink"/>
@@ -3321,7 +3297,6 @@
                 </w:rPr>
                 <w:t>52</w:t>
               </w:r>
-              <w:proofErr w:type="spellStart"/>
               <w:r>
                 <w:rPr>
                   <w:rStyle w:val="Hyperlink"/>
@@ -3329,7 +3304,6 @@
                 </w:rPr>
                 <w:t>hReEGtTh</w:t>
               </w:r>
-              <w:proofErr w:type="spellEnd"/>
               <w:r>
                 <w:rPr>
                   <w:rStyle w:val="Hyperlink"/>
@@ -3351,7 +3325,6 @@
                 </w:rPr>
                 <w:t>7</w:t>
               </w:r>
-              <w:proofErr w:type="spellStart"/>
               <w:r>
                 <w:rPr>
                   <w:rStyle w:val="Hyperlink"/>
@@ -3359,7 +3332,6 @@
                 </w:rPr>
                 <w:t>BBBuiBLVQ</w:t>
               </w:r>
-              <w:proofErr w:type="spellEnd"/>
               <w:r>
                 <w:rPr>
                   <w:rStyle w:val="Hyperlink"/>
@@ -3367,7 +3339,6 @@
                 </w:rPr>
                 <w:t>3</w:t>
               </w:r>
-              <w:proofErr w:type="spellStart"/>
               <w:r>
                 <w:rPr>
                   <w:rStyle w:val="Hyperlink"/>
@@ -3375,7 +3346,6 @@
                 </w:rPr>
                 <w:t>BWWao</w:t>
               </w:r>
-              <w:proofErr w:type="spellEnd"/>
               <w:r>
                 <w:rPr>
                   <w:rStyle w:val="Hyperlink"/>
@@ -3400,7 +3370,7 @@
             </w:pPr>
           </w:p>
           <w:p>
-            <w:hyperlink r:id="rId22" w:history="1">
+            <w:hyperlink r:id="rId23" w:history="1">
               <w:r>
                 <w:rPr>
                   <w:rStyle w:val="Hyperlink"/>
@@ -3435,7 +3405,7 @@
             <w:tcW w:w="6938" w:type="dxa"/>
           </w:tcPr>
           <w:p>
-            <w:hyperlink r:id="rId23" w:history="1">
+            <w:hyperlink r:id="rId24" w:history="1">
               <w:r>
                 <w:rPr>
                   <w:rStyle w:val="Hyperlink"/>
@@ -3461,29 +3431,21 @@
               <w:rPr>
                 <w:lang w:val="en-US"/>
               </w:rPr>
-              <w:t xml:space="preserve">Necro </w:t>
-            </w:r>
-            <w:proofErr w:type="spellStart"/>
-            <w:r>
+              <w:t>Necro Mancer</w:t>
+            </w:r>
+          </w:p>
+        </w:tc>
+        <w:tc>
+          <w:tcPr>
+            <w:tcW w:w="6938" w:type="dxa"/>
+          </w:tcPr>
+          <w:p>
+            <w:pPr>
               <w:rPr>
                 <w:lang w:val="en-US"/>
               </w:rPr>
-              <w:t>Mancer</w:t>
-            </w:r>
-            <w:proofErr w:type="spellEnd"/>
-          </w:p>
-        </w:tc>
-        <w:tc>
-          <w:tcPr>
-            <w:tcW w:w="6938" w:type="dxa"/>
-          </w:tcPr>
-          <w:p>
-            <w:pPr>
-              <w:rPr>
-                <w:lang w:val="en-US"/>
-              </w:rPr>
-            </w:pPr>
-            <w:hyperlink r:id="rId24" w:history="1">
+            </w:pPr>
+            <w:hyperlink r:id="rId25" w:history="1">
               <w:r>
                 <w:rPr>
                   <w:rStyle w:val="Hyperlink"/>
@@ -3506,14 +3468,12 @@
                 <w:lang w:val="en-US"/>
               </w:rPr>
             </w:pPr>
-            <w:proofErr w:type="spellStart"/>
             <w:r>
               <w:rPr>
                 <w:lang w:val="en-US"/>
               </w:rPr>
               <w:t>Timenote</w:t>
             </w:r>
-            <w:proofErr w:type="spellEnd"/>
           </w:p>
         </w:tc>
         <w:tc>
@@ -3526,7 +3486,7 @@
                 <w:lang w:val="en-US"/>
               </w:rPr>
             </w:pPr>
-            <w:hyperlink r:id="rId25" w:history="1">
+            <w:hyperlink r:id="rId26" w:history="1">
               <w:r>
                 <w:rPr>
                   <w:rStyle w:val="Hyperlink"/>
@@ -3638,7 +3598,7 @@
                           </pic:cNvPicPr>
                         </pic:nvPicPr>
                         <pic:blipFill>
-                          <a:blip r:embed="rId26">
+                          <a:blip r:embed="rId27">
                             <a:extLst>
                               <a:ext uri="{28A0092B-C50C-407E-A947-70E740481C1C}">
                                 <a14:useLocalDpi xmlns:a14="http://schemas.microsoft.com/office/drawing/2010/main" val="0"/>
@@ -4350,10 +4310,10 @@
           <w:noProof/>
         </w:rPr>
         <w:drawing>
-          <wp:inline distT="0" distB="0" distL="0" distR="0" wp14:anchorId="558ED924" wp14:editId="4904ACFF">
-            <wp:extent cx="4144433" cy="4191000"/>
-            <wp:effectExtent l="0" t="0" r="8890" b="0"/>
-            <wp:docPr id="7" name="Picture 7"/>
+          <wp:inline distT="0" distB="0" distL="0" distR="0" wp14:anchorId="3E19AC35" wp14:editId="558EC68B">
+            <wp:extent cx="3573167" cy="4600575"/>
+            <wp:effectExtent l="0" t="0" r="8255" b="0"/>
+            <wp:docPr id="4" name="Picture 4"/>
             <wp:cNvGraphicFramePr>
               <a:graphicFrameLocks xmlns:a="http://schemas.openxmlformats.org/drawingml/2006/main" noChangeAspect="1"/>
             </wp:cNvGraphicFramePr>
@@ -4361,13 +4321,13 @@
               <a:graphicData uri="http://schemas.openxmlformats.org/drawingml/2006/picture">
                 <pic:pic xmlns:pic="http://schemas.openxmlformats.org/drawingml/2006/picture">
                   <pic:nvPicPr>
-                    <pic:cNvPr id="0" name="Picture 9"/>
+                    <pic:cNvPr id="0" name="Picture 1"/>
                     <pic:cNvPicPr>
                       <a:picLocks noChangeAspect="1" noChangeArrowheads="1"/>
                     </pic:cNvPicPr>
                   </pic:nvPicPr>
                   <pic:blipFill>
-                    <a:blip r:embed="rId26">
+                    <a:blip r:embed="rId28" cstate="print">
                       <a:extLst>
                         <a:ext uri="{28A0092B-C50C-407E-A947-70E740481C1C}">
                           <a14:useLocalDpi xmlns:a14="http://schemas.microsoft.com/office/drawing/2010/main" val="0"/>
@@ -4382,7 +4342,7 @@
                   <pic:spPr bwMode="auto">
                     <a:xfrm>
                       <a:off x="0" y="0"/>
-                      <a:ext cx="4145718" cy="4192300"/>
+                      <a:ext cx="3585217" cy="4616090"/>
                     </a:xfrm>
                     <a:prstGeom prst="rect">
                       <a:avLst/>
@@ -4444,7 +4404,7 @@
       </w:r>
     </w:p>
     <w:p>
-      <w:hyperlink r:id="rId27" w:history="1">
+      <w:hyperlink r:id="rId29" w:history="1">
         <w:r>
           <w:rPr>
             <w:rStyle w:val="Hyperlink"/>
@@ -4465,7 +4425,7 @@
       </w:r>
     </w:p>
     <w:p>
-      <w:hyperlink r:id="rId28" w:history="1">
+      <w:hyperlink r:id="rId30" w:history="1">
         <w:r>
           <w:rPr>
             <w:rStyle w:val="Hyperlink"/>
@@ -4483,7 +4443,7 @@
       </w:r>
     </w:p>
     <w:p>
-      <w:hyperlink r:id="rId29" w:history="1">
+      <w:hyperlink r:id="rId31" w:history="1">
         <w:r>
           <w:rPr>
             <w:rStyle w:val="Hyperlink"/>
@@ -4504,7 +4464,7 @@
       <w:bookmarkEnd w:id="15"/>
     </w:p>
     <w:p>
-      <w:hyperlink r:id="rId30" w:history="1">
+      <w:hyperlink r:id="rId32" w:history="1">
         <w:r>
           <w:rPr>
             <w:rStyle w:val="Hyperlink"/>
@@ -4570,7 +4530,7 @@
             <w:tcW w:w="6938" w:type="dxa"/>
           </w:tcPr>
           <w:p>
-            <w:hyperlink r:id="rId31" w:history="1">
+            <w:hyperlink r:id="rId33" w:history="1">
               <w:r>
                 <w:rPr>
                   <w:rStyle w:val="Hyperlink"/>
@@ -4605,7 +4565,7 @@
             <w:tcW w:w="6938" w:type="dxa"/>
           </w:tcPr>
           <w:p>
-            <w:hyperlink r:id="rId32" w:history="1">
+            <w:hyperlink r:id="rId34" w:history="1">
               <w:r>
                 <w:rPr>
                   <w:rStyle w:val="Hyperlink"/>
@@ -4631,29 +4591,21 @@
               <w:rPr>
                 <w:lang w:val="en-US"/>
               </w:rPr>
-              <w:t xml:space="preserve">Necro </w:t>
-            </w:r>
-            <w:proofErr w:type="spellStart"/>
-            <w:r>
+              <w:t>Necro Mancer</w:t>
+            </w:r>
+          </w:p>
+        </w:tc>
+        <w:tc>
+          <w:tcPr>
+            <w:tcW w:w="6938" w:type="dxa"/>
+          </w:tcPr>
+          <w:p>
+            <w:pPr>
               <w:rPr>
                 <w:lang w:val="en-US"/>
               </w:rPr>
-              <w:t>Mancer</w:t>
-            </w:r>
-            <w:proofErr w:type="spellEnd"/>
-          </w:p>
-        </w:tc>
-        <w:tc>
-          <w:tcPr>
-            <w:tcW w:w="6938" w:type="dxa"/>
-          </w:tcPr>
-          <w:p>
-            <w:pPr>
-              <w:rPr>
-                <w:lang w:val="en-US"/>
-              </w:rPr>
-            </w:pPr>
-            <w:hyperlink r:id="rId33" w:history="1">
+            </w:pPr>
+            <w:hyperlink r:id="rId35" w:history="1">
               <w:r>
                 <w:rPr>
                   <w:rStyle w:val="Hyperlink"/>
@@ -4678,7 +4630,7 @@
       </w:pPr>
     </w:p>
     <w:sectPr>
-      <w:footerReference w:type="default" r:id="rId34"/>
+      <w:footerReference w:type="default" r:id="rId36"/>
       <w:pgSz w:w="11906" w:h="16838"/>
       <w:pgMar w:top="851" w:right="851" w:bottom="851" w:left="851" w:header="709" w:footer="709" w:gutter="0"/>
       <w:pgNumType w:start="0"/>

</xml_diff>